<commit_message>
Update blank intake form child sex options
</commit_message>
<xml_diff>
--- a/public/ClientIntakeForm_Blank_Download.docx
+++ b/public/ClientIntakeForm_Blank_Download.docx
@@ -922,297 +922,258 @@
         <w:rPr>
           <w:rFonts w:ascii="Cambria" w:eastAsia="Cambria" w:hAnsi="Cambria" w:cs="Cambria"/>
         </w:rPr>
-        <w:t xml:space="preserve">Name: </w:t>
-      </w:r>
-      <w:r>
-        <w:rPr>
-          <w:rFonts w:ascii="Cambria" w:eastAsia="Cambria" w:hAnsi="Cambria" w:cs="Cambria"/>
-          <w:u w:val="single"/>
-        </w:rPr>
-        <w:tab/>
-      </w:r>
-      <w:r>
-        <w:rPr>
-          <w:rFonts w:ascii="Cambria" w:eastAsia="Cambria" w:hAnsi="Cambria" w:cs="Cambria"/>
-          <w:u w:val="single"/>
-        </w:rPr>
-        <w:tab/>
-      </w:r>
-      <w:r>
-        <w:rPr>
-          <w:rFonts w:ascii="Cambria" w:eastAsia="Cambria" w:hAnsi="Cambria" w:cs="Cambria"/>
-          <w:u w:val="single"/>
-        </w:rPr>
-        <w:tab/>
-      </w:r>
-      <w:r>
-        <w:rPr>
-          <w:rFonts w:ascii="Cambria" w:eastAsia="Cambria" w:hAnsi="Cambria" w:cs="Cambria"/>
-          <w:u w:val="single"/>
-        </w:rPr>
-        <w:tab/>
-      </w:r>
-      <w:r>
-        <w:rPr>
-          <w:rFonts w:ascii="Cambria" w:eastAsia="Cambria" w:hAnsi="Cambria" w:cs="Cambria"/>
-          <w:u w:val="single"/>
-        </w:rPr>
-        <w:tab/>
-      </w:r>
-      <w:r>
-        <w:rPr>
-          <w:rFonts w:ascii="Cambria" w:eastAsia="Cambria" w:hAnsi="Cambria" w:cs="Cambria"/>
-          <w:u w:val="single"/>
-        </w:rPr>
-        <w:tab/>
-      </w:r>
-      <w:r>
-        <w:rPr>
-          <w:rFonts w:ascii="Cambria" w:eastAsia="Cambria" w:hAnsi="Cambria" w:cs="Cambria"/>
-          <w:u w:val="single"/>
-        </w:rPr>
-        <w:tab/>
-      </w:r>
-      <w:r>
-        <w:rPr>
-          <w:rFonts w:ascii="Cambria" w:eastAsia="Cambria" w:hAnsi="Cambria" w:cs="Cambria"/>
-        </w:rPr>
-        <w:t xml:space="preserve"> Date of Birth: </w:t>
-      </w:r>
-      <w:r>
-        <w:rPr>
-          <w:rFonts w:ascii="Cambria" w:eastAsia="Cambria" w:hAnsi="Cambria" w:cs="Cambria"/>
-        </w:rPr>
-        <w:t>_______________________</w:t>
-      </w:r>
-    </w:p>
-    <w:p>
-      <w:pPr>
-        <w:spacing w:line="480" w:lineRule="auto"/>
-        <w:rPr>
-          <w:rFonts w:ascii="Cambria" w:eastAsia="Cambria" w:hAnsi="Cambria" w:cs="Cambria"/>
-          <w:u w:val="single"/>
-        </w:rPr>
-      </w:pPr>
-      <w:r>
-        <w:rPr>
-          <w:rFonts w:ascii="Cambria" w:eastAsia="Cambria" w:hAnsi="Cambria" w:cs="Cambria"/>
-        </w:rPr>
-        <w:t xml:space="preserve">Name: </w:t>
-      </w:r>
-      <w:r>
-        <w:rPr>
-          <w:rFonts w:ascii="Cambria" w:eastAsia="Cambria" w:hAnsi="Cambria" w:cs="Cambria"/>
-          <w:u w:val="single"/>
-        </w:rPr>
-        <w:t xml:space="preserve"> </w:t>
-      </w:r>
-      <w:r>
-        <w:rPr>
-          <w:rFonts w:ascii="Cambria" w:eastAsia="Cambria" w:hAnsi="Cambria" w:cs="Cambria"/>
-          <w:u w:val="single"/>
-        </w:rPr>
-        <w:tab/>
-      </w:r>
-      <w:r>
-        <w:rPr>
-          <w:rFonts w:ascii="Cambria" w:eastAsia="Cambria" w:hAnsi="Cambria" w:cs="Cambria"/>
-          <w:u w:val="single"/>
-        </w:rPr>
-        <w:tab/>
-      </w:r>
-      <w:r>
-        <w:rPr>
-          <w:rFonts w:ascii="Cambria" w:eastAsia="Cambria" w:hAnsi="Cambria" w:cs="Cambria"/>
-          <w:u w:val="single"/>
-        </w:rPr>
-        <w:tab/>
-      </w:r>
-      <w:r>
-        <w:rPr>
-          <w:rFonts w:ascii="Cambria" w:eastAsia="Cambria" w:hAnsi="Cambria" w:cs="Cambria"/>
-          <w:u w:val="single"/>
-        </w:rPr>
-        <w:tab/>
-      </w:r>
-      <w:r>
-        <w:rPr>
-          <w:rFonts w:ascii="Cambria" w:eastAsia="Cambria" w:hAnsi="Cambria" w:cs="Cambria"/>
-          <w:u w:val="single"/>
-        </w:rPr>
-        <w:tab/>
-      </w:r>
-      <w:r>
-        <w:rPr>
-          <w:rFonts w:ascii="Cambria" w:eastAsia="Cambria" w:hAnsi="Cambria" w:cs="Cambria"/>
-          <w:u w:val="single"/>
-        </w:rPr>
-        <w:tab/>
-      </w:r>
-      <w:r>
-        <w:rPr>
-          <w:rFonts w:ascii="Cambria" w:eastAsia="Cambria" w:hAnsi="Cambria" w:cs="Cambria"/>
-        </w:rPr>
-        <w:t xml:space="preserve">Date of Birth: </w:t>
-      </w:r>
-      <w:r>
-        <w:rPr>
-          <w:rFonts w:ascii="Cambria" w:eastAsia="Cambria" w:hAnsi="Cambria" w:cs="Cambria"/>
-        </w:rPr>
-        <w:t>________________________</w:t>
-      </w:r>
-    </w:p>
-    <w:p>
-      <w:pPr>
-        <w:spacing w:line="480" w:lineRule="auto"/>
-        <w:rPr>
-          <w:rFonts w:ascii="Cambria" w:eastAsia="Cambria" w:hAnsi="Cambria" w:cs="Cambria"/>
-          <w:u w:val="single"/>
-        </w:rPr>
-      </w:pPr>
-      <w:r>
-        <w:rPr>
-          <w:rFonts w:ascii="Cambria" w:eastAsia="Cambria" w:hAnsi="Cambria" w:cs="Cambria"/>
-        </w:rPr>
-        <w:t xml:space="preserve">Name: </w:t>
-      </w:r>
-      <w:r>
-        <w:rPr>
-          <w:rFonts w:ascii="Cambria" w:eastAsia="Cambria" w:hAnsi="Cambria" w:cs="Cambria"/>
-          <w:u w:val="single"/>
-        </w:rPr>
-        <w:tab/>
-      </w:r>
-      <w:r>
-        <w:rPr>
-          <w:rFonts w:ascii="Cambria" w:eastAsia="Cambria" w:hAnsi="Cambria" w:cs="Cambria"/>
-          <w:u w:val="single"/>
-        </w:rPr>
-        <w:tab/>
-      </w:r>
-      <w:r>
-        <w:rPr>
-          <w:rFonts w:ascii="Cambria" w:eastAsia="Cambria" w:hAnsi="Cambria" w:cs="Cambria"/>
-          <w:u w:val="single"/>
-        </w:rPr>
-        <w:tab/>
-      </w:r>
-      <w:r>
-        <w:rPr>
-          <w:rFonts w:ascii="Cambria" w:eastAsia="Cambria" w:hAnsi="Cambria" w:cs="Cambria"/>
-          <w:u w:val="single"/>
-        </w:rPr>
-        <w:tab/>
-      </w:r>
-      <w:r>
-        <w:rPr>
-          <w:rFonts w:ascii="Cambria" w:eastAsia="Cambria" w:hAnsi="Cambria" w:cs="Cambria"/>
-          <w:u w:val="single"/>
-        </w:rPr>
-        <w:tab/>
-      </w:r>
-      <w:r>
-        <w:rPr>
-          <w:rFonts w:ascii="Cambria" w:eastAsia="Cambria" w:hAnsi="Cambria" w:cs="Cambria"/>
-          <w:u w:val="single"/>
-        </w:rPr>
-        <w:tab/>
-      </w:r>
-      <w:r>
-        <w:rPr>
-          <w:rFonts w:ascii="Cambria" w:eastAsia="Cambria" w:hAnsi="Cambria" w:cs="Cambria"/>
-          <w:u w:val="single"/>
-        </w:rPr>
-        <w:tab/>
-      </w:r>
-      <w:r>
-        <w:rPr>
-          <w:rFonts w:ascii="Cambria" w:eastAsia="Cambria" w:hAnsi="Cambria" w:cs="Cambria"/>
-        </w:rPr>
-        <w:t xml:space="preserve">Date of Birth: </w:t>
-      </w:r>
-      <w:r>
-        <w:rPr>
-          <w:rFonts w:ascii="Cambria" w:eastAsia="Cambria" w:hAnsi="Cambria" w:cs="Cambria"/>
-          <w:u w:val="single"/>
-        </w:rPr>
-        <w:t>________________________</w:t>
-      </w:r>
-    </w:p>
-    <w:p>
-      <w:pPr>
-        <w:spacing w:line="480" w:lineRule="auto"/>
-        <w:rPr>
-          <w:rFonts w:ascii="Cambria" w:eastAsia="Cambria" w:hAnsi="Cambria" w:cs="Cambria"/>
-          <w:u w:val="single"/>
-        </w:rPr>
-      </w:pPr>
-      <w:r>
-        <w:rPr>
-          <w:rFonts w:ascii="Cambria" w:eastAsia="Cambria" w:hAnsi="Cambria" w:cs="Cambria"/>
-        </w:rPr>
-        <w:t xml:space="preserve">Name: </w:t>
-      </w:r>
-      <w:r>
-        <w:tab/>
-      </w:r>
-      <w:r>
-        <w:rPr>
-          <w:rFonts w:ascii="Cambria" w:eastAsia="Cambria" w:hAnsi="Cambria" w:cs="Cambria"/>
-          <w:u w:val="single"/>
-        </w:rPr>
-        <w:tab/>
-      </w:r>
-      <w:r>
-        <w:rPr>
-          <w:rFonts w:ascii="Cambria" w:eastAsia="Cambria" w:hAnsi="Cambria" w:cs="Cambria"/>
-          <w:u w:val="single"/>
-        </w:rPr>
-        <w:tab/>
-      </w:r>
-      <w:r>
-        <w:rPr>
-          <w:rFonts w:ascii="Cambria" w:eastAsia="Cambria" w:hAnsi="Cambria" w:cs="Cambria"/>
-          <w:u w:val="single"/>
-        </w:rPr>
-        <w:tab/>
-      </w:r>
-      <w:r>
-        <w:rPr>
-          <w:rFonts w:ascii="Cambria" w:eastAsia="Cambria" w:hAnsi="Cambria" w:cs="Cambria"/>
-          <w:u w:val="single"/>
-        </w:rPr>
-        <w:tab/>
-      </w:r>
-      <w:r>
-        <w:rPr>
-          <w:rFonts w:ascii="Cambria" w:eastAsia="Cambria" w:hAnsi="Cambria" w:cs="Cambria"/>
-          <w:u w:val="single"/>
-        </w:rPr>
-        <w:tab/>
-      </w:r>
-      <w:r>
-        <w:rPr>
-          <w:rFonts w:ascii="Cambria" w:eastAsia="Cambria" w:hAnsi="Cambria" w:cs="Cambria"/>
-          <w:u w:val="single"/>
-        </w:rPr>
-        <w:tab/>
-      </w:r>
-      <w:r>
-        <w:rPr>
-          <w:rFonts w:ascii="Cambria" w:eastAsia="Cambria" w:hAnsi="Cambria" w:cs="Cambria"/>
-        </w:rPr>
-        <w:t xml:space="preserve">Date of Birth: </w:t>
-      </w:r>
-      <w:r>
-        <w:tab/>
-      </w:r>
-      <w:r>
-        <w:rPr>
-          <w:rFonts w:ascii="Cambria" w:eastAsia="Cambria" w:hAnsi="Cambria" w:cs="Cambria"/>
-          <w:u w:val="single"/>
-        </w:rPr>
-        <w:t>________________________</w:t>
+        <w:t>Name: ____________________________   Date of Birth: ______________   Sex: ☐ Male   ☐ Female</w:t>
+      </w:r>
+      <w:r>
+        <w:rPr>
+          <w:rFonts w:ascii="Cambria" w:eastAsia="Cambria" w:hAnsi="Cambria" w:cs="Cambria"/>
+          <w:u w:val="single"/>
+        </w:rPr>
+      </w:r>
+      <w:r>
+        <w:rPr>
+          <w:rFonts w:ascii="Cambria" w:eastAsia="Cambria" w:hAnsi="Cambria" w:cs="Cambria"/>
+          <w:u w:val="single"/>
+        </w:rPr>
+      </w:r>
+      <w:r>
+        <w:rPr>
+          <w:rFonts w:ascii="Cambria" w:eastAsia="Cambria" w:hAnsi="Cambria" w:cs="Cambria"/>
+          <w:u w:val="single"/>
+        </w:rPr>
+      </w:r>
+      <w:r>
+        <w:rPr>
+          <w:rFonts w:ascii="Cambria" w:eastAsia="Cambria" w:hAnsi="Cambria" w:cs="Cambria"/>
+          <w:u w:val="single"/>
+        </w:rPr>
+      </w:r>
+      <w:r>
+        <w:rPr>
+          <w:rFonts w:ascii="Cambria" w:eastAsia="Cambria" w:hAnsi="Cambria" w:cs="Cambria"/>
+          <w:u w:val="single"/>
+        </w:rPr>
+      </w:r>
+      <w:r>
+        <w:rPr>
+          <w:rFonts w:ascii="Cambria" w:eastAsia="Cambria" w:hAnsi="Cambria" w:cs="Cambria"/>
+          <w:u w:val="single"/>
+        </w:rPr>
+      </w:r>
+      <w:r>
+        <w:rPr>
+          <w:rFonts w:ascii="Cambria" w:eastAsia="Cambria" w:hAnsi="Cambria" w:cs="Cambria"/>
+          <w:u w:val="single"/>
+        </w:rPr>
+      </w:r>
+      <w:r>
+        <w:rPr>
+          <w:rFonts w:ascii="Cambria" w:eastAsia="Cambria" w:hAnsi="Cambria" w:cs="Cambria"/>
+        </w:rPr>
+      </w:r>
+      <w:r>
+        <w:rPr>
+          <w:rFonts w:ascii="Cambria" w:eastAsia="Cambria" w:hAnsi="Cambria" w:cs="Cambria"/>
+        </w:rPr>
+      </w:r>
+    </w:p>
+    <w:p>
+      <w:pPr>
+        <w:spacing w:line="480" w:lineRule="auto"/>
+        <w:rPr>
+          <w:rFonts w:ascii="Cambria" w:eastAsia="Cambria" w:hAnsi="Cambria" w:cs="Cambria"/>
+          <w:u w:val="single"/>
+        </w:rPr>
+      </w:pPr>
+      <w:r>
+        <w:rPr>
+          <w:rFonts w:ascii="Cambria" w:eastAsia="Cambria" w:hAnsi="Cambria" w:cs="Cambria"/>
+        </w:rPr>
+        <w:t>Name: ____________________________   Date of Birth: ______________   Sex: ☐ Male   ☐ Female</w:t>
+      </w:r>
+      <w:r>
+        <w:rPr>
+          <w:rFonts w:ascii="Cambria" w:eastAsia="Cambria" w:hAnsi="Cambria" w:cs="Cambria"/>
+          <w:u w:val="single"/>
+        </w:rPr>
+      </w:r>
+      <w:r>
+        <w:rPr>
+          <w:rFonts w:ascii="Cambria" w:eastAsia="Cambria" w:hAnsi="Cambria" w:cs="Cambria"/>
+          <w:u w:val="single"/>
+        </w:rPr>
+      </w:r>
+      <w:r>
+        <w:rPr>
+          <w:rFonts w:ascii="Cambria" w:eastAsia="Cambria" w:hAnsi="Cambria" w:cs="Cambria"/>
+          <w:u w:val="single"/>
+        </w:rPr>
+      </w:r>
+      <w:r>
+        <w:rPr>
+          <w:rFonts w:ascii="Cambria" w:eastAsia="Cambria" w:hAnsi="Cambria" w:cs="Cambria"/>
+          <w:u w:val="single"/>
+        </w:rPr>
+      </w:r>
+      <w:r>
+        <w:rPr>
+          <w:rFonts w:ascii="Cambria" w:eastAsia="Cambria" w:hAnsi="Cambria" w:cs="Cambria"/>
+          <w:u w:val="single"/>
+        </w:rPr>
+      </w:r>
+      <w:r>
+        <w:rPr>
+          <w:rFonts w:ascii="Cambria" w:eastAsia="Cambria" w:hAnsi="Cambria" w:cs="Cambria"/>
+          <w:u w:val="single"/>
+        </w:rPr>
+      </w:r>
+      <w:r>
+        <w:rPr>
+          <w:rFonts w:ascii="Cambria" w:eastAsia="Cambria" w:hAnsi="Cambria" w:cs="Cambria"/>
+          <w:u w:val="single"/>
+        </w:rPr>
+      </w:r>
+      <w:r>
+        <w:rPr>
+          <w:rFonts w:ascii="Cambria" w:eastAsia="Cambria" w:hAnsi="Cambria" w:cs="Cambria"/>
+        </w:rPr>
+      </w:r>
+      <w:r>
+        <w:rPr>
+          <w:rFonts w:ascii="Cambria" w:eastAsia="Cambria" w:hAnsi="Cambria" w:cs="Cambria"/>
+        </w:rPr>
+      </w:r>
+    </w:p>
+    <w:p>
+      <w:pPr>
+        <w:spacing w:line="480" w:lineRule="auto"/>
+        <w:rPr>
+          <w:rFonts w:ascii="Cambria" w:eastAsia="Cambria" w:hAnsi="Cambria" w:cs="Cambria"/>
+          <w:u w:val="single"/>
+        </w:rPr>
+      </w:pPr>
+      <w:r>
+        <w:rPr>
+          <w:rFonts w:ascii="Cambria" w:eastAsia="Cambria" w:hAnsi="Cambria" w:cs="Cambria"/>
+        </w:rPr>
+        <w:t>Name: ____________________________   Date of Birth: ______________   Sex: ☐ Male   ☐ Female</w:t>
+      </w:r>
+      <w:r>
+        <w:rPr>
+          <w:rFonts w:ascii="Cambria" w:eastAsia="Cambria" w:hAnsi="Cambria" w:cs="Cambria"/>
+          <w:u w:val="single"/>
+        </w:rPr>
+      </w:r>
+      <w:r>
+        <w:rPr>
+          <w:rFonts w:ascii="Cambria" w:eastAsia="Cambria" w:hAnsi="Cambria" w:cs="Cambria"/>
+          <w:u w:val="single"/>
+        </w:rPr>
+      </w:r>
+      <w:r>
+        <w:rPr>
+          <w:rFonts w:ascii="Cambria" w:eastAsia="Cambria" w:hAnsi="Cambria" w:cs="Cambria"/>
+          <w:u w:val="single"/>
+        </w:rPr>
+      </w:r>
+      <w:r>
+        <w:rPr>
+          <w:rFonts w:ascii="Cambria" w:eastAsia="Cambria" w:hAnsi="Cambria" w:cs="Cambria"/>
+          <w:u w:val="single"/>
+        </w:rPr>
+      </w:r>
+      <w:r>
+        <w:rPr>
+          <w:rFonts w:ascii="Cambria" w:eastAsia="Cambria" w:hAnsi="Cambria" w:cs="Cambria"/>
+          <w:u w:val="single"/>
+        </w:rPr>
+      </w:r>
+      <w:r>
+        <w:rPr>
+          <w:rFonts w:ascii="Cambria" w:eastAsia="Cambria" w:hAnsi="Cambria" w:cs="Cambria"/>
+          <w:u w:val="single"/>
+        </w:rPr>
+      </w:r>
+      <w:r>
+        <w:rPr>
+          <w:rFonts w:ascii="Cambria" w:eastAsia="Cambria" w:hAnsi="Cambria" w:cs="Cambria"/>
+          <w:u w:val="single"/>
+        </w:rPr>
+      </w:r>
+      <w:r>
+        <w:rPr>
+          <w:rFonts w:ascii="Cambria" w:eastAsia="Cambria" w:hAnsi="Cambria" w:cs="Cambria"/>
+        </w:rPr>
+      </w:r>
+      <w:r>
+        <w:rPr>
+          <w:rFonts w:ascii="Cambria" w:eastAsia="Cambria" w:hAnsi="Cambria" w:cs="Cambria"/>
+          <w:u w:val="single"/>
+        </w:rPr>
+      </w:r>
+    </w:p>
+    <w:p>
+      <w:pPr>
+        <w:spacing w:line="480" w:lineRule="auto"/>
+        <w:rPr>
+          <w:rFonts w:ascii="Cambria" w:eastAsia="Cambria" w:hAnsi="Cambria" w:cs="Cambria"/>
+          <w:u w:val="single"/>
+        </w:rPr>
+      </w:pPr>
+      <w:r>
+        <w:rPr>
+          <w:rFonts w:ascii="Cambria" w:eastAsia="Cambria" w:hAnsi="Cambria" w:cs="Cambria"/>
+        </w:rPr>
+        <w:t>Name: ____________________________   Date of Birth: ______________   Sex: ☐ Male   ☐ Female</w:t>
+      </w:r>
+      <w:r/>
+      <w:r>
+        <w:rPr>
+          <w:rFonts w:ascii="Cambria" w:eastAsia="Cambria" w:hAnsi="Cambria" w:cs="Cambria"/>
+          <w:u w:val="single"/>
+        </w:rPr>
+      </w:r>
+      <w:r>
+        <w:rPr>
+          <w:rFonts w:ascii="Cambria" w:eastAsia="Cambria" w:hAnsi="Cambria" w:cs="Cambria"/>
+          <w:u w:val="single"/>
+        </w:rPr>
+      </w:r>
+      <w:r>
+        <w:rPr>
+          <w:rFonts w:ascii="Cambria" w:eastAsia="Cambria" w:hAnsi="Cambria" w:cs="Cambria"/>
+          <w:u w:val="single"/>
+        </w:rPr>
+      </w:r>
+      <w:r>
+        <w:rPr>
+          <w:rFonts w:ascii="Cambria" w:eastAsia="Cambria" w:hAnsi="Cambria" w:cs="Cambria"/>
+          <w:u w:val="single"/>
+        </w:rPr>
+      </w:r>
+      <w:r>
+        <w:rPr>
+          <w:rFonts w:ascii="Cambria" w:eastAsia="Cambria" w:hAnsi="Cambria" w:cs="Cambria"/>
+          <w:u w:val="single"/>
+        </w:rPr>
+      </w:r>
+      <w:r>
+        <w:rPr>
+          <w:rFonts w:ascii="Cambria" w:eastAsia="Cambria" w:hAnsi="Cambria" w:cs="Cambria"/>
+          <w:u w:val="single"/>
+        </w:rPr>
+      </w:r>
+      <w:r>
+        <w:rPr>
+          <w:rFonts w:ascii="Cambria" w:eastAsia="Cambria" w:hAnsi="Cambria" w:cs="Cambria"/>
+        </w:rPr>
+      </w:r>
+      <w:r/>
+      <w:r>
+        <w:rPr>
+          <w:rFonts w:ascii="Cambria" w:eastAsia="Cambria" w:hAnsi="Cambria" w:cs="Cambria"/>
+          <w:u w:val="single"/>
+        </w:rPr>
       </w:r>
     </w:p>
     <w:p>

</xml_diff>